<commit_message>
genomics: fix figure layouts (no overlapping boxes, legends off the data), Mermaid diagrams in RESULTS.md, neutral team note
</commit_message>
<xml_diff>
--- a/genomics/docs/report/ProGenome_KT.docx
+++ b/genomics/docs/report/ProGenome_KT.docx
@@ -238,7 +238,7 @@
       <w:r>
         <w:drawing>
           <wp:inline distT="0" distB="0" distL="0" distR="0">
-            <wp:extent cx="5791200" cy="2286000"/>
+            <wp:extent cx="5791200" cy="2466975"/>
             <wp:effectExtent t="0" r="0" b="0" l="0"/>
             <wp:docPr id="1" name="" descr="" title=""/>
             <wp:cNvGraphicFramePr>
@@ -263,7 +263,7 @@
                   <pic:spPr bwMode="auto">
                     <a:xfrm>
                       <a:off x="0" y="0"/>
-                      <a:ext cx="5791200" cy="2286000"/>
+                      <a:ext cx="5791200" cy="2466975"/>
                     </a:xfrm>
                     <a:prstGeom prst="rect">
                       <a:avLst/>
@@ -2592,7 +2592,7 @@
       <w:r>
         <w:drawing>
           <wp:inline distT="0" distB="0" distL="0" distR="0">
-            <wp:extent cx="5610225" cy="4381500"/>
+            <wp:extent cx="5610225" cy="5000625"/>
             <wp:effectExtent t="0" r="0" b="0" l="0"/>
             <wp:docPr id="1" name="" descr="" title=""/>
             <wp:cNvGraphicFramePr>
@@ -2617,7 +2617,7 @@
                   <pic:spPr bwMode="auto">
                     <a:xfrm>
                       <a:off x="0" y="0"/>
-                      <a:ext cx="5610225" cy="4381500"/>
+                      <a:ext cx="5610225" cy="5000625"/>
                     </a:xfrm>
                     <a:prstGeom prst="rect">
                       <a:avLst/>
@@ -5797,29 +5797,29 @@
                 <w:sz w:val="18"/>
                 <w:szCs w:val="18"/>
               </w:rPr>
-              <w:t xml:space="preserve">yes, in both senses of cluster: groups of people (AUC 0.60 genome, 0.96 proteome, 0.99 both; embedding silhouette 0.70) and haploblock clusters tied to the phenotype (saliency top 3 all causal). Main's own PyG models on a protein-only graph stay at AUC 0.51-0.52 because patients are not nodes there; the person-level graph is what makes the GNN work</w:t>
-            </w:r>
-          </w:p>
-        </w:tc>
-        <w:tc>
-          <w:tcPr>
-            <w:tcW w:type="dxa" w:w="0"/>
-            <w:tcMar>
-              <w:top w:type="dxa" w:w="60"/>
-              <w:left w:type="dxa" w:w="80"/>
-              <w:bottom w:type="dxa" w:w="60"/>
-              <w:right w:type="dxa" w:w="80"/>
-            </w:tcMar>
-          </w:tcPr>
-          <w:p>
-            <w:r>
-              <w:rPr>
-                <w:b w:val="false"/>
-                <w:bCs w:val="false"/>
-                <w:sz w:val="18"/>
-                <w:szCs w:val="18"/>
-              </w:rPr>
-              <w:t xml:space="preserve">sections 8, 9, 14; Part II ground truth tables</w:t>
+              <w:t xml:space="preserve">yes, in both senses of cluster: groups of people (AUC 0.60 genome, 0.96 proteome, 0.99 both; embedding silhouette 0.70) and haploblock clusters tied to the phenotype (saliency top 3 all causal); the person-level graph, with every participant as a node, is what lets the GNN use both modalities</w:t>
+            </w:r>
+          </w:p>
+        </w:tc>
+        <w:tc>
+          <w:tcPr>
+            <w:tcW w:type="dxa" w:w="0"/>
+            <w:tcMar>
+              <w:top w:type="dxa" w:w="60"/>
+              <w:left w:type="dxa" w:w="80"/>
+              <w:bottom w:type="dxa" w:w="60"/>
+              <w:right w:type="dxa" w:w="80"/>
+            </w:tcMar>
+          </w:tcPr>
+          <w:p>
+            <w:r>
+              <w:rPr>
+                <w:b w:val="false"/>
+                <w:bCs w:val="false"/>
+                <w:sz w:val="18"/>
+                <w:szCs w:val="18"/>
+              </w:rPr>
+              <w:t xml:space="preserve">sections 8, 9; Part II ground truth tables</w:t>
             </w:r>
           </w:p>
         </w:tc>
@@ -6426,7 +6426,7 @@
       <w:r>
         <w:drawing>
           <wp:inline distT="0" distB="0" distL="0" distR="0">
-            <wp:extent cx="5610225" cy="1828800"/>
+            <wp:extent cx="5610225" cy="2371725"/>
             <wp:effectExtent t="0" r="0" b="0" l="0"/>
             <wp:docPr id="1" name="" descr="" title=""/>
             <wp:cNvGraphicFramePr>
@@ -6451,7 +6451,7 @@
                   <pic:spPr bwMode="auto">
                     <a:xfrm>
                       <a:off x="0" y="0"/>
-                      <a:ext cx="5610225" cy="1828800"/>
+                      <a:ext cx="5610225" cy="2371725"/>
                     </a:xfrm>
                     <a:prstGeom prst="rect">
                       <a:avLst/>
@@ -7147,7 +7147,7 @@
                 <w:sz w:val="18"/>
                 <w:szCs w:val="18"/>
               </w:rPr>
-              <w:t xml:space="preserve">Validated the proteomics plumbing and the team's logistic, federated-logistic and PyG comparisons on main; cannot join the genome (ids are not 1000G ids, phenotype has no genomic part)</w:t>
+              <w:t xml:space="preserve">The team's proteomics analyses on main run on it; for the genome join a version keyed to 1000G ids was needed (next row)</w:t>
             </w:r>
           </w:p>
         </w:tc>
@@ -7367,7 +7367,7 @@
       <w:r>
         <w:drawing>
           <wp:inline distT="0" distB="0" distL="0" distR="0">
-            <wp:extent cx="5610225" cy="2295525"/>
+            <wp:extent cx="5610225" cy="2009775"/>
             <wp:effectExtent t="0" r="0" b="0" l="0"/>
             <wp:docPr id="1" name="" descr="" title=""/>
             <wp:cNvGraphicFramePr>
@@ -7392,7 +7392,7 @@
                   <pic:spPr bwMode="auto">
                     <a:xfrm>
                       <a:off x="0" y="0"/>
-                      <a:ext cx="5610225" cy="2295525"/>
+                      <a:ext cx="5610225" cy="2009775"/>
                     </a:xfrm>
                     <a:prstGeom prst="rect">
                       <a:avLst/>
@@ -9792,7 +9792,7 @@
       <w:r>
         <w:drawing>
           <wp:inline distT="0" distB="0" distL="0" distR="0">
-            <wp:extent cx="5610225" cy="1933575"/>
+            <wp:extent cx="5610225" cy="1905000"/>
             <wp:effectExtent t="0" r="0" b="0" l="0"/>
             <wp:docPr id="1" name="" descr="" title=""/>
             <wp:cNvGraphicFramePr>
@@ -9817,7 +9817,7 @@
                   <pic:spPr bwMode="auto">
                     <a:xfrm>
                       <a:off x="0" y="0"/>
-                      <a:ext cx="5610225" cy="1933575"/>
+                      <a:ext cx="5610225" cy="1905000"/>
                     </a:xfrm>
                     <a:prstGeom prst="rect">
                       <a:avLst/>
@@ -9852,7 +9852,7 @@
       <w:r>
         <w:drawing>
           <wp:inline distT="0" distB="0" distL="0" distR="0">
-            <wp:extent cx="5610225" cy="1638300"/>
+            <wp:extent cx="5610225" cy="1609725"/>
             <wp:effectExtent t="0" r="0" b="0" l="0"/>
             <wp:docPr id="1" name="" descr="" title=""/>
             <wp:cNvGraphicFramePr>
@@ -9877,7 +9877,7 @@
                   <pic:spPr bwMode="auto">
                     <a:xfrm>
                       <a:off x="0" y="0"/>
-                      <a:ext cx="5610225" cy="1638300"/>
+                      <a:ext cx="5610225" cy="1609725"/>
                     </a:xfrm>
                     <a:prstGeom prst="rect">
                       <a:avLst/>
@@ -9912,7 +9912,7 @@
       <w:r>
         <w:drawing>
           <wp:inline distT="0" distB="0" distL="0" distR="0">
-            <wp:extent cx="5610225" cy="1781175"/>
+            <wp:extent cx="5610225" cy="1666875"/>
             <wp:effectExtent t="0" r="0" b="0" l="0"/>
             <wp:docPr id="1" name="" descr="" title=""/>
             <wp:cNvGraphicFramePr>
@@ -9937,7 +9937,7 @@
                   <pic:spPr bwMode="auto">
                     <a:xfrm>
                       <a:off x="0" y="0"/>
-                      <a:ext cx="5610225" cy="1781175"/>
+                      <a:ext cx="5610225" cy="1666875"/>
                     </a:xfrm>
                     <a:prstGeom prst="rect">
                       <a:avLst/>
@@ -10095,7 +10095,7 @@
       <w:r>
         <w:drawing>
           <wp:inline distT="0" distB="0" distL="0" distR="0">
-            <wp:extent cx="5019675" cy="2867025"/>
+            <wp:extent cx="5019675" cy="2847975"/>
             <wp:effectExtent t="0" r="0" b="0" l="0"/>
             <wp:docPr id="1" name="" descr="" title=""/>
             <wp:cNvGraphicFramePr>
@@ -10120,7 +10120,7 @@
                   <pic:spPr bwMode="auto">
                     <a:xfrm>
                       <a:off x="0" y="0"/>
-                      <a:ext cx="5019675" cy="2867025"/>
+                      <a:ext cx="5019675" cy="2847975"/>
                     </a:xfrm>
                     <a:prstGeom prst="rect">
                       <a:avLst/>
@@ -10155,7 +10155,7 @@
       <w:r>
         <w:drawing>
           <wp:inline distT="0" distB="0" distL="0" distR="0">
-            <wp:extent cx="5610225" cy="2247900"/>
+            <wp:extent cx="5610225" cy="2114550"/>
             <wp:effectExtent t="0" r="0" b="0" l="0"/>
             <wp:docPr id="1" name="" descr="" title=""/>
             <wp:cNvGraphicFramePr>
@@ -10180,7 +10180,7 @@
                   <pic:spPr bwMode="auto">
                     <a:xfrm>
                       <a:off x="0" y="0"/>
-                      <a:ext cx="5610225" cy="2247900"/>
+                      <a:ext cx="5610225" cy="2114550"/>
                     </a:xfrm>
                     <a:prstGeom prst="rect">
                       <a:avLst/>
@@ -10215,7 +10215,7 @@
       <w:r>
         <w:drawing>
           <wp:inline distT="0" distB="0" distL="0" distR="0">
-            <wp:extent cx="5019675" cy="2867025"/>
+            <wp:extent cx="5019675" cy="2847975"/>
             <wp:effectExtent t="0" r="0" b="0" l="0"/>
             <wp:docPr id="1" name="" descr="" title=""/>
             <wp:cNvGraphicFramePr>
@@ -10240,7 +10240,7 @@
                   <pic:spPr bwMode="auto">
                     <a:xfrm>
                       <a:off x="0" y="0"/>
-                      <a:ext cx="5019675" cy="2867025"/>
+                      <a:ext cx="5019675" cy="2847975"/>
                     </a:xfrm>
                     <a:prstGeom prst="rect">
                       <a:avLst/>
@@ -10275,7 +10275,7 @@
       <w:r>
         <w:drawing>
           <wp:inline distT="0" distB="0" distL="0" distR="0">
-            <wp:extent cx="3543300" cy="3543300"/>
+            <wp:extent cx="3543300" cy="3514725"/>
             <wp:effectExtent t="0" r="0" b="0" l="0"/>
             <wp:docPr id="1" name="" descr="" title=""/>
             <wp:cNvGraphicFramePr>
@@ -10300,7 +10300,7 @@
                   <pic:spPr bwMode="auto">
                     <a:xfrm>
                       <a:off x="0" y="0"/>
-                      <a:ext cx="3543300" cy="3543300"/>
+                      <a:ext cx="3543300" cy="3514725"/>
                     </a:xfrm>
                     <a:prstGeom prst="rect">
                       <a:avLst/>
@@ -10343,7 +10343,7 @@
       <w:r>
         <w:drawing>
           <wp:inline distT="0" distB="0" distL="0" distR="0">
-            <wp:extent cx="5610225" cy="1952625"/>
+            <wp:extent cx="5610225" cy="2066925"/>
             <wp:effectExtent t="0" r="0" b="0" l="0"/>
             <wp:docPr id="1" name="" descr="" title=""/>
             <wp:cNvGraphicFramePr>
@@ -10368,7 +10368,7 @@
                   <pic:spPr bwMode="auto">
                     <a:xfrm>
                       <a:off x="0" y="0"/>
-                      <a:ext cx="5610225" cy="1952625"/>
+                      <a:ext cx="5610225" cy="2066925"/>
                     </a:xfrm>
                     <a:prstGeom prst="rect">
                       <a:avLst/>
@@ -11585,7 +11585,7 @@
       <w:r>
         <w:drawing>
           <wp:inline distT="0" distB="0" distL="0" distR="0">
-            <wp:extent cx="5019675" cy="3705225"/>
+            <wp:extent cx="5019675" cy="4048125"/>
             <wp:effectExtent t="0" r="0" b="0" l="0"/>
             <wp:docPr id="1" name="" descr="" title=""/>
             <wp:cNvGraphicFramePr>
@@ -11610,7 +11610,7 @@
                   <pic:spPr bwMode="auto">
                     <a:xfrm>
                       <a:off x="0" y="0"/>
-                      <a:ext cx="5019675" cy="3705225"/>
+                      <a:ext cx="5019675" cy="4048125"/>
                     </a:xfrm>
                     <a:prstGeom prst="rect">
                       <a:avLst/>
@@ -11669,7 +11669,7 @@
       <w:r>
         <w:drawing>
           <wp:inline distT="0" distB="0" distL="0" distR="0">
-            <wp:extent cx="5610225" cy="2447925"/>
+            <wp:extent cx="5610225" cy="2381250"/>
             <wp:effectExtent t="0" r="0" b="0" l="0"/>
             <wp:docPr id="1" name="" descr="" title=""/>
             <wp:cNvGraphicFramePr>
@@ -11694,7 +11694,7 @@
                   <pic:spPr bwMode="auto">
                     <a:xfrm>
                       <a:off x="0" y="0"/>
-                      <a:ext cx="5610225" cy="2447925"/>
+                      <a:ext cx="5610225" cy="2381250"/>
                     </a:xfrm>
                     <a:prstGeom prst="rect">
                       <a:avLst/>
@@ -11729,7 +11729,7 @@
       <w:r>
         <w:drawing>
           <wp:inline distT="0" distB="0" distL="0" distR="0">
-            <wp:extent cx="4133850" cy="3305175"/>
+            <wp:extent cx="4133850" cy="3390900"/>
             <wp:effectExtent t="0" r="0" b="0" l="0"/>
             <wp:docPr id="1" name="" descr="" title=""/>
             <wp:cNvGraphicFramePr>
@@ -11754,7 +11754,7 @@
                   <pic:spPr bwMode="auto">
                     <a:xfrm>
                       <a:off x="0" y="0"/>
-                      <a:ext cx="4133850" cy="3305175"/>
+                      <a:ext cx="4133850" cy="3390900"/>
                     </a:xfrm>
                     <a:prstGeom prst="rect">
                       <a:avLst/>
@@ -11789,7 +11789,7 @@
       <w:r>
         <w:drawing>
           <wp:inline distT="0" distB="0" distL="0" distR="0">
-            <wp:extent cx="5314950" cy="1809750"/>
+            <wp:extent cx="5314950" cy="1695450"/>
             <wp:effectExtent t="0" r="0" b="0" l="0"/>
             <wp:docPr id="1" name="" descr="" title=""/>
             <wp:cNvGraphicFramePr>
@@ -11814,7 +11814,7 @@
                   <pic:spPr bwMode="auto">
                     <a:xfrm>
                       <a:off x="0" y="0"/>
-                      <a:ext cx="5314950" cy="1809750"/>
+                      <a:ext cx="5314950" cy="1695450"/>
                     </a:xfrm>
                     <a:prstGeom prst="rect">
                       <a:avLst/>
@@ -11849,7 +11849,7 @@
       <w:r>
         <w:drawing>
           <wp:inline distT="0" distB="0" distL="0" distR="0">
-            <wp:extent cx="5314950" cy="1914525"/>
+            <wp:extent cx="5314950" cy="1876425"/>
             <wp:effectExtent t="0" r="0" b="0" l="0"/>
             <wp:docPr id="1" name="" descr="" title=""/>
             <wp:cNvGraphicFramePr>
@@ -11874,7 +11874,7 @@
                   <pic:spPr bwMode="auto">
                     <a:xfrm>
                       <a:off x="0" y="0"/>
-                      <a:ext cx="5314950" cy="1914525"/>
+                      <a:ext cx="5314950" cy="1876425"/>
                     </a:xfrm>
                     <a:prstGeom prst="rect">
                       <a:avLst/>
@@ -12479,7 +12479,7 @@
       <w:r>
         <w:drawing>
           <wp:inline distT="0" distB="0" distL="0" distR="0">
-            <wp:extent cx="4133850" cy="2009775"/>
+            <wp:extent cx="4133850" cy="1971675"/>
             <wp:effectExtent t="0" r="0" b="0" l="0"/>
             <wp:docPr id="1" name="" descr="" title=""/>
             <wp:cNvGraphicFramePr>
@@ -12504,7 +12504,7 @@
                   <pic:spPr bwMode="auto">
                     <a:xfrm>
                       <a:off x="0" y="0"/>
-                      <a:ext cx="4133850" cy="2009775"/>
+                      <a:ext cx="4133850" cy="1971675"/>
                     </a:xfrm>
                     <a:prstGeom prst="rect">
                       <a:avLst/>
@@ -13291,7 +13291,7 @@
       <w:r>
         <w:drawing>
           <wp:inline distT="0" distB="0" distL="0" distR="0">
-            <wp:extent cx="5314950" cy="2124075"/>
+            <wp:extent cx="5314950" cy="2085975"/>
             <wp:effectExtent t="0" r="0" b="0" l="0"/>
             <wp:docPr id="1" name="" descr="" title=""/>
             <wp:cNvGraphicFramePr>
@@ -13316,7 +13316,7 @@
                   <pic:spPr bwMode="auto">
                     <a:xfrm>
                       <a:off x="0" y="0"/>
-                      <a:ext cx="5314950" cy="2124075"/>
+                      <a:ext cx="5314950" cy="2085975"/>
                     </a:xfrm>
                     <a:prstGeom prst="rect">
                       <a:avLst/>
@@ -13351,7 +13351,7 @@
       <w:r>
         <w:drawing>
           <wp:inline distT="0" distB="0" distL="0" distR="0">
-            <wp:extent cx="5610225" cy="1838325"/>
+            <wp:extent cx="5610225" cy="1800225"/>
             <wp:effectExtent t="0" r="0" b="0" l="0"/>
             <wp:docPr id="1" name="" descr="" title=""/>
             <wp:cNvGraphicFramePr>
@@ -13376,7 +13376,7 @@
                   <pic:spPr bwMode="auto">
                     <a:xfrm>
                       <a:off x="0" y="0"/>
-                      <a:ext cx="5610225" cy="1838325"/>
+                      <a:ext cx="5610225" cy="1800225"/>
                     </a:xfrm>
                     <a:prstGeom prst="rect">
                       <a:avLst/>
@@ -13411,7 +13411,7 @@
       <w:r>
         <w:drawing>
           <wp:inline distT="0" distB="0" distL="0" distR="0">
-            <wp:extent cx="5610225" cy="1905000"/>
+            <wp:extent cx="5610225" cy="1866900"/>
             <wp:effectExtent t="0" r="0" b="0" l="0"/>
             <wp:docPr id="1" name="" descr="" title=""/>
             <wp:cNvGraphicFramePr>
@@ -13436,7 +13436,7 @@
                   <pic:spPr bwMode="auto">
                     <a:xfrm>
                       <a:off x="0" y="0"/>
-                      <a:ext cx="5610225" cy="1905000"/>
+                      <a:ext cx="5610225" cy="1866900"/>
                     </a:xfrm>
                     <a:prstGeom prst="rect">
                       <a:avLst/>
@@ -13471,7 +13471,7 @@
       <w:r>
         <w:drawing>
           <wp:inline distT="0" distB="0" distL="0" distR="0">
-            <wp:extent cx="5019675" cy="2133600"/>
+            <wp:extent cx="5019675" cy="2095500"/>
             <wp:effectExtent t="0" r="0" b="0" l="0"/>
             <wp:docPr id="1" name="" descr="" title=""/>
             <wp:cNvGraphicFramePr>
@@ -13496,7 +13496,7 @@
                   <pic:spPr bwMode="auto">
                     <a:xfrm>
                       <a:off x="0" y="0"/>
-                      <a:ext cx="5019675" cy="2133600"/>
+                      <a:ext cx="5019675" cy="2095500"/>
                     </a:xfrm>
                     <a:prstGeom prst="rect">
                       <a:avLst/>
@@ -13555,7 +13555,7 @@
       <w:r>
         <w:drawing>
           <wp:inline distT="0" distB="0" distL="0" distR="0">
-            <wp:extent cx="5610225" cy="1952625"/>
+            <wp:extent cx="5610225" cy="2447925"/>
             <wp:effectExtent t="0" r="0" b="0" l="0"/>
             <wp:docPr id="1" name="" descr="" title=""/>
             <wp:cNvGraphicFramePr>
@@ -13580,7 +13580,7 @@
                   <pic:spPr bwMode="auto">
                     <a:xfrm>
                       <a:off x="0" y="0"/>
-                      <a:ext cx="5610225" cy="1952625"/>
+                      <a:ext cx="5610225" cy="2447925"/>
                     </a:xfrm>
                     <a:prstGeom prst="rect">
                       <a:avLst/>
@@ -14184,7 +14184,7 @@
       <w:r>
         <w:drawing>
           <wp:inline distT="0" distB="0" distL="0" distR="0">
-            <wp:extent cx="5314950" cy="2257425"/>
+            <wp:extent cx="5314950" cy="2238375"/>
             <wp:effectExtent t="0" r="0" b="0" l="0"/>
             <wp:docPr id="1" name="" descr="" title=""/>
             <wp:cNvGraphicFramePr>
@@ -14209,7 +14209,7 @@
                   <pic:spPr bwMode="auto">
                     <a:xfrm>
                       <a:off x="0" y="0"/>
-                      <a:ext cx="5314950" cy="2257425"/>
+                      <a:ext cx="5314950" cy="2238375"/>
                     </a:xfrm>
                     <a:prstGeom prst="rect">
                       <a:avLst/>
@@ -14268,7 +14268,7 @@
       <w:r>
         <w:drawing>
           <wp:inline distT="0" distB="0" distL="0" distR="0">
-            <wp:extent cx="4724400" cy="2124075"/>
+            <wp:extent cx="4724400" cy="2085975"/>
             <wp:effectExtent t="0" r="0" b="0" l="0"/>
             <wp:docPr id="1" name="" descr="" title=""/>
             <wp:cNvGraphicFramePr>
@@ -14293,7 +14293,7 @@
                   <pic:spPr bwMode="auto">
                     <a:xfrm>
                       <a:off x="0" y="0"/>
-                      <a:ext cx="4724400" cy="2124075"/>
+                      <a:ext cx="4724400" cy="2085975"/>
                     </a:xfrm>
                     <a:prstGeom prst="rect">
                       <a:avLst/>
@@ -15920,7 +15920,7 @@
       <w:r>
         <w:drawing>
           <wp:inline distT="0" distB="0" distL="0" distR="0">
-            <wp:extent cx="5019675" cy="1781175"/>
+            <wp:extent cx="5019675" cy="1743075"/>
             <wp:effectExtent t="0" r="0" b="0" l="0"/>
             <wp:docPr id="1" name="" descr="" title=""/>
             <wp:cNvGraphicFramePr>
@@ -15945,7 +15945,7 @@
                   <pic:spPr bwMode="auto">
                     <a:xfrm>
                       <a:off x="0" y="0"/>
-                      <a:ext cx="5019675" cy="1781175"/>
+                      <a:ext cx="5019675" cy="1743075"/>
                     </a:xfrm>
                     <a:prstGeom prst="rect">
                       <a:avLst/>
@@ -18213,15 +18213,7 @@
         <w:spacing w:after="140"/>
       </w:pPr>
       <w:r>
-        <w:t xml:space="preserve">Sixteen commits landed on main during the hackathon (scripts/, docs/, methods_and_results.md, haplograph/). They form a proteomics-centred pipeline on the team's synthetic data, regenerated with 4,000 SITE-id samples: a filtered logistic regression (held-out AUC 0.933), a hand-written FedAvg over three sites with logistic models (five rounds; proteomics alone AUC 0.962, adding age, sex and haplograph summaries changes AUC by less than 0.001), a protein-centred knowledge graph built from a haplograph edge list annotated with the UniProt proteins each block overlaps, and two PyTorch Geometric models on a protein-projected graph (PyGCN 1 with GCNConv, PyGCN 2 with GATv2Conv) that score near chance (test AUC 0.51 and 0.52). Their report concludes that the graph models need a different patient-level graph formulation and richer node features.</w:t>
-      </w:r>
-    </w:p>
-    <w:p>
-      <w:pPr>
-        <w:spacing w:after="140"/>
-      </w:pPr>
-      <w:r>
-        <w:t xml:space="preserve">That patient-level formulation is exactly what genomics/ provides, and it is why the two lines of work fit together rather than compete: on main the patients are not in the graph (their ids are SITE1_PT0001, not 1000G ids, so they cannot be attached to any haplotype cluster), which leaves a GNN nothing patient-specific to propagate; in genomics/ every person is a node joined by their real 1000G id to the clusters they carry and to their protein measurements, and the same GNN family then reaches AUC 0.99 with the graph adding signal over the proteome alone. Main's annotated edge list (haplograph/edges_lift_above_threshold_uniprot.csv.gz) is the same HaploGraph edge file with block-to-protein annotations that genomics/ derives from the BED at build time. Nothing in genomics/ overlaps a path on main, so the branch merges cleanly; the natural join for the manuscript is: main's proteomics analysis and federated logistic baseline, genomics/ for the graph model, the integration result, the decoder and the NVFlare run.</w:t>
+        <w:t xml:space="preserve">The team's proteomics work on main (the synthetic proteomics generator with 4,000 SITE-id samples, protein filtering and classification baselines, a protein-centred knowledge graph built from the HaploGraph edge list annotated with UniProt proteins, a federated comparison of feature sets, and methods_and_results.md) covers the proteome side and the federated logistic setting. genomics/ adds the genome side: the person-level knowledge graph on the 1000 Genomes ids, the graph neural network, the LLM decoder and the NVFlare run. The two share the same HaploGraph edge file, the same UniProt gene BED and the same three-site design, and they are complementary: nothing in genomics/ touches a path on main, so the branch merges cleanly, and for the manuscript the proteomics analysis and the graph model plug into the same methods and results structure.</w:t>
       </w:r>
     </w:p>
     <w:p>

</xml_diff>

<commit_message>
genomics: results page diagrams readable on GitHub, legend fixes, report rebuilt
</commit_message>
<xml_diff>
--- a/genomics/docs/report/ProGenome_KT.docx
+++ b/genomics/docs/report/ProGenome_KT.docx
@@ -9852,7 +9852,7 @@
       <w:r>
         <w:drawing>
           <wp:inline distT="0" distB="0" distL="0" distR="0">
-            <wp:extent cx="5610225" cy="1609725"/>
+            <wp:extent cx="5610225" cy="1581150"/>
             <wp:effectExtent t="0" r="0" b="0" l="0"/>
             <wp:docPr id="1" name="" descr="" title=""/>
             <wp:cNvGraphicFramePr>
@@ -9877,7 +9877,7 @@
                   <pic:spPr bwMode="auto">
                     <a:xfrm>
                       <a:off x="0" y="0"/>
-                      <a:ext cx="5610225" cy="1609725"/>
+                      <a:ext cx="5610225" cy="1581150"/>
                     </a:xfrm>
                     <a:prstGeom prst="rect">
                       <a:avLst/>

</xml_diff>

<commit_message>
genomics: one-page system architecture figure for the deck, results page and report
</commit_message>
<xml_diff>
--- a/genomics/docs/report/ProGenome_KT.docx
+++ b/genomics/docs/report/ProGenome_KT.docx
@@ -14451,7 +14451,7 @@
       <w:r>
         <w:drawing>
           <wp:inline distT="0" distB="0" distL="0" distR="0">
-            <wp:extent cx="5610225" cy="11744325"/>
+            <wp:extent cx="5791200" cy="2562225"/>
             <wp:effectExtent t="0" r="0" b="0" l="0"/>
             <wp:docPr id="1" name="" descr="" title=""/>
             <wp:cNvGraphicFramePr>
@@ -14476,7 +14476,7 @@
                   <pic:spPr bwMode="auto">
                     <a:xfrm>
                       <a:off x="0" y="0"/>
-                      <a:ext cx="5610225" cy="11744325"/>
+                      <a:ext cx="5791200" cy="2562225"/>
                     </a:xfrm>
                     <a:prstGeom prst="rect">
                       <a:avLst/>
@@ -14501,7 +14501,7 @@
           <w:sz w:val="18"/>
           <w:szCs w:val="18"/>
         </w:rPr>
-        <w:t xml:space="preserve">The architecture page (docs/architecture.html): data lanes, schema, federated topology, stack and measured numbers.</w:t>
+        <w:t xml:space="preserve">System architecture on one page: private hospital sites, the shared reference graph, the GNN encoder trained through the NVFlare server, and the outputs feeding the LLM decoder.</w:t>
       </w:r>
     </w:p>
     <w:tbl>

</xml_diff>

<commit_message>
genomics: per-site alone vs federated tables (150 and 50 steps, averages, transfer) and a worked decoder example
</commit_message>
<xml_diff>
--- a/genomics/docs/report/ProGenome_KT.docx
+++ b/genomics/docs/report/ProGenome_KT.docx
@@ -5362,6 +5362,650 @@
         <w:t xml:space="preserve">The language model is not part of training and makes no prediction. It sits after the encoder, once per person, as the decoder: graphrag_decoder.py walks the graph around one person and collects facts (their ancestry-informative clusters with blocks, genes and proteins; their most extreme protein levels and the block that encodes each; the GNN's prediction; the salient clusters they carry; their five nearest neighbours in the embedding), serialises them as JSON and asks the NIM model (nvidia/nemotron-3-super-120b-a12b) to write a structured report using only those facts and citing every id verbatim. The code then checks each cited id against the context. What this achieves is the last step the README's mission implies, turning numbers into an insight a research team can read: a summary, an ancestry assessment, a phenotype assessment, explicit genome-to-proteome links and caveats, each traceable to graph ids. For HG00103 (EUR, GBR, 994 clusters carried, predicted control) the model answered in 13 seconds from a 4,555-token context with a 1,020-token reply, cited 25 ids and invented none; its links named, for example, cluster chr22_40032702-40132216_cluster151 in the block encoding TNRC6B (protein Q9UPQ9) and cluster chr22_26024448-26060666_cluster35 in the block encoding MYO18B (Q8IUG5), and its caveats stated that the phenotype is synthetic and that ancestry is population structure, not a medical finding. Without an API key the same script prints the exact prompt (dry run), so the retrieval can be inspected offline.</w:t>
       </w:r>
     </w:p>
+    <w:tbl>
+      <w:tblPr>
+        <w:tblW w:type="dxa" w:w="9638"/>
+        <w:tblBorders>
+          <w:top w:val="single" w:color="999999" w:sz="4"/>
+          <w:left w:val="none" w:sz="0"/>
+          <w:bottom w:val="single" w:color="999999" w:sz="4"/>
+          <w:right w:val="none" w:sz="0"/>
+          <w:insideH w:val="single" w:color="CCCCCC" w:sz="2"/>
+          <w:insideV w:val="none" w:sz="0"/>
+        </w:tblBorders>
+      </w:tblPr>
+      <w:tblGrid>
+        <w:gridCol w:w="3373"/>
+        <w:gridCol w:w="6265"/>
+      </w:tblGrid>
+      <w:tr>
+        <w:trPr>
+          <w:tblHeader/>
+        </w:trPr>
+        <w:tc>
+          <w:tcPr>
+            <w:tcW w:type="dxa" w:w="0"/>
+            <w:shd w:fill="E6ECEB" w:color="auto" w:val="clear"/>
+            <w:tcMar>
+              <w:top w:type="dxa" w:w="60"/>
+              <w:left w:type="dxa" w:w="80"/>
+              <w:bottom w:type="dxa" w:w="60"/>
+              <w:right w:type="dxa" w:w="80"/>
+            </w:tcMar>
+          </w:tcPr>
+          <w:p>
+            <w:r>
+              <w:rPr>
+                <w:b/>
+                <w:bCs/>
+                <w:sz w:val="18"/>
+                <w:szCs w:val="18"/>
+              </w:rPr>
+              <w:t xml:space="preserve">Retrieved fact for HG00103</w:t>
+            </w:r>
+          </w:p>
+        </w:tc>
+        <w:tc>
+          <w:tcPr>
+            <w:tcW w:type="dxa" w:w="0"/>
+            <w:shd w:fill="E6ECEB" w:color="auto" w:val="clear"/>
+            <w:tcMar>
+              <w:top w:type="dxa" w:w="60"/>
+              <w:left w:type="dxa" w:w="80"/>
+              <w:bottom w:type="dxa" w:w="60"/>
+              <w:right w:type="dxa" w:w="80"/>
+            </w:tcMar>
+          </w:tcPr>
+          <w:p>
+            <w:r>
+              <w:rPr>
+                <w:b/>
+                <w:bCs/>
+                <w:sz w:val="18"/>
+                <w:szCs w:val="18"/>
+              </w:rPr>
+              <w:t xml:space="preserve">Value</w:t>
+            </w:r>
+          </w:p>
+        </w:tc>
+      </w:tr>
+      <w:tr>
+        <w:trPr>
+          <w:tblHeader w:val="false"/>
+        </w:trPr>
+        <w:tc>
+          <w:tcPr>
+            <w:tcW w:type="dxa" w:w="0"/>
+            <w:tcMar>
+              <w:top w:type="dxa" w:w="60"/>
+              <w:left w:type="dxa" w:w="80"/>
+              <w:bottom w:type="dxa" w:w="60"/>
+              <w:right w:type="dxa" w:w="80"/>
+            </w:tcMar>
+          </w:tcPr>
+          <w:p>
+            <w:r>
+              <w:rPr>
+                <w:b w:val="false"/>
+                <w:bCs w:val="false"/>
+                <w:sz w:val="18"/>
+                <w:szCs w:val="18"/>
+              </w:rPr>
+              <w:t xml:space="preserve">GNN prediction</w:t>
+            </w:r>
+          </w:p>
+        </w:tc>
+        <w:tc>
+          <w:tcPr>
+            <w:tcW w:type="dxa" w:w="0"/>
+            <w:tcMar>
+              <w:top w:type="dxa" w:w="60"/>
+              <w:left w:type="dxa" w:w="80"/>
+              <w:bottom w:type="dxa" w:w="60"/>
+              <w:right w:type="dxa" w:w="80"/>
+            </w:tcMar>
+          </w:tcPr>
+          <w:p>
+            <w:r>
+              <w:rPr>
+                <w:b w:val="false"/>
+                <w:bCs w:val="false"/>
+                <w:sz w:val="18"/>
+                <w:szCs w:val="18"/>
+              </w:rPr>
+              <w:t xml:space="preserve">control (truth: control)</w:t>
+            </w:r>
+          </w:p>
+        </w:tc>
+      </w:tr>
+      <w:tr>
+        <w:trPr>
+          <w:tblHeader w:val="false"/>
+        </w:trPr>
+        <w:tc>
+          <w:tcPr>
+            <w:tcW w:type="dxa" w:w="0"/>
+            <w:tcMar>
+              <w:top w:type="dxa" w:w="60"/>
+              <w:left w:type="dxa" w:w="80"/>
+              <w:bottom w:type="dxa" w:w="60"/>
+              <w:right w:type="dxa" w:w="80"/>
+            </w:tcMar>
+          </w:tcPr>
+          <w:p>
+            <w:r>
+              <w:rPr>
+                <w:b w:val="false"/>
+                <w:bCs w:val="false"/>
+                <w:sz w:val="18"/>
+                <w:szCs w:val="18"/>
+              </w:rPr>
+              <w:t xml:space="preserve">globally salient clusters carried</w:t>
+            </w:r>
+          </w:p>
+        </w:tc>
+        <w:tc>
+          <w:tcPr>
+            <w:tcW w:type="dxa" w:w="0"/>
+            <w:tcMar>
+              <w:top w:type="dxa" w:w="60"/>
+              <w:left w:type="dxa" w:w="80"/>
+              <w:bottom w:type="dxa" w:w="60"/>
+              <w:right w:type="dxa" w:w="80"/>
+            </w:tcMar>
+          </w:tcPr>
+          <w:p>
+            <w:r>
+              <w:rPr>
+                <w:b w:val="false"/>
+                <w:bCs w:val="false"/>
+                <w:sz w:val="18"/>
+                <w:szCs w:val="18"/>
+              </w:rPr>
+              <w:t xml:space="preserve">chr22_46902935-46974137_cluster186 (0.110), chr22_46974137-47051453_cluster43 (0.055), chr22_40032702-40132216_cluster25 (0.046)</w:t>
+            </w:r>
+          </w:p>
+        </w:tc>
+      </w:tr>
+      <w:tr>
+        <w:trPr>
+          <w:tblHeader w:val="false"/>
+        </w:trPr>
+        <w:tc>
+          <w:tcPr>
+            <w:tcW w:type="dxa" w:w="0"/>
+            <w:tcMar>
+              <w:top w:type="dxa" w:w="60"/>
+              <w:left w:type="dxa" w:w="80"/>
+              <w:bottom w:type="dxa" w:w="60"/>
+              <w:right w:type="dxa" w:w="80"/>
+            </w:tcMar>
+          </w:tcPr>
+          <w:p>
+            <w:r>
+              <w:rPr>
+                <w:b w:val="false"/>
+                <w:bCs w:val="false"/>
+                <w:sz w:val="18"/>
+                <w:szCs w:val="18"/>
+              </w:rPr>
+              <w:t xml:space="preserve">most ancestry-informative clusters, with block genes and proteins</w:t>
+            </w:r>
+          </w:p>
+        </w:tc>
+        <w:tc>
+          <w:tcPr>
+            <w:tcW w:type="dxa" w:w="0"/>
+            <w:tcMar>
+              <w:top w:type="dxa" w:w="60"/>
+              <w:left w:type="dxa" w:w="80"/>
+              <w:bottom w:type="dxa" w:w="60"/>
+              <w:right w:type="dxa" w:w="80"/>
+            </w:tcMar>
+          </w:tcPr>
+          <w:p>
+            <w:r>
+              <w:rPr>
+                <w:b w:val="false"/>
+                <w:bCs w:val="false"/>
+                <w:sz w:val="18"/>
+                <w:szCs w:val="18"/>
+              </w:rPr>
+              <w:t xml:space="preserve">cluster151 of block 40032702-40132216 (TNRC6B, Q9UPQ9); cluster545 of 35738379-36060254 (RBFOX2, O43251); cluster35 of 26024448-26060666 (MYO18B, Q8IUG5)</w:t>
+            </w:r>
+          </w:p>
+        </w:tc>
+      </w:tr>
+      <w:tr>
+        <w:trPr>
+          <w:tblHeader w:val="false"/>
+        </w:trPr>
+        <w:tc>
+          <w:tcPr>
+            <w:tcW w:type="dxa" w:w="0"/>
+            <w:tcMar>
+              <w:top w:type="dxa" w:w="60"/>
+              <w:left w:type="dxa" w:w="80"/>
+              <w:bottom w:type="dxa" w:w="60"/>
+              <w:right w:type="dxa" w:w="80"/>
+            </w:tcMar>
+          </w:tcPr>
+          <w:p>
+            <w:r>
+              <w:rPr>
+                <w:b w:val="false"/>
+                <w:bCs w:val="false"/>
+                <w:sz w:val="18"/>
+                <w:szCs w:val="18"/>
+              </w:rPr>
+              <w:t xml:space="preserve">most extreme protein levels (z)</w:t>
+            </w:r>
+          </w:p>
+        </w:tc>
+        <w:tc>
+          <w:tcPr>
+            <w:tcW w:type="dxa" w:w="0"/>
+            <w:tcMar>
+              <w:top w:type="dxa" w:w="60"/>
+              <w:left w:type="dxa" w:w="80"/>
+              <w:bottom w:type="dxa" w:w="60"/>
+              <w:right w:type="dxa" w:w="80"/>
+            </w:tcMar>
+          </w:tcPr>
+          <w:p>
+            <w:r>
+              <w:rPr>
+                <w:b w:val="false"/>
+                <w:bCs w:val="false"/>
+                <w:sz w:val="18"/>
+                <w:szCs w:val="18"/>
+              </w:rPr>
+              <w:t xml:space="preserve">H1-0 +2.75, RIMBP3 -2.65, INPP5J +2.53, CRYBA4 +2.52, YWHAH +2.37</w:t>
+            </w:r>
+          </w:p>
+        </w:tc>
+      </w:tr>
+      <w:tr>
+        <w:trPr>
+          <w:tblHeader w:val="false"/>
+        </w:trPr>
+        <w:tc>
+          <w:tcPr>
+            <w:tcW w:type="dxa" w:w="0"/>
+            <w:tcMar>
+              <w:top w:type="dxa" w:w="60"/>
+              <w:left w:type="dxa" w:w="80"/>
+              <w:bottom w:type="dxa" w:w="60"/>
+              <w:right w:type="dxa" w:w="80"/>
+            </w:tcMar>
+          </w:tcPr>
+          <w:p>
+            <w:r>
+              <w:rPr>
+                <w:b w:val="false"/>
+                <w:bCs w:val="false"/>
+                <w:sz w:val="18"/>
+                <w:szCs w:val="18"/>
+              </w:rPr>
+              <w:t xml:space="preserve">nearest people in the embedding</w:t>
+            </w:r>
+          </w:p>
+        </w:tc>
+        <w:tc>
+          <w:tcPr>
+            <w:tcW w:type="dxa" w:w="0"/>
+            <w:tcMar>
+              <w:top w:type="dxa" w:w="60"/>
+              <w:left w:type="dxa" w:w="80"/>
+              <w:bottom w:type="dxa" w:w="60"/>
+              <w:right w:type="dxa" w:w="80"/>
+            </w:tcMar>
+          </w:tcPr>
+          <w:p>
+            <w:r>
+              <w:rPr>
+                <w:b w:val="false"/>
+                <w:bCs w:val="false"/>
+                <w:sz w:val="18"/>
+                <w:szCs w:val="18"/>
+              </w:rPr>
+              <w:t xml:space="preserve">HG01767 (EUR), NA12842 (EUR), HG00351 (EUR), HG04002 (SAS), HG00336 (EUR)</w:t>
+            </w:r>
+          </w:p>
+        </w:tc>
+      </w:tr>
+    </w:tbl>
+    <w:p>
+      <w:pPr>
+        <w:spacing w:after="160"/>
+      </w:pPr>
+    </w:p>
+    <w:tbl>
+      <w:tblPr>
+        <w:tblW w:type="dxa" w:w="9638"/>
+        <w:tblBorders>
+          <w:top w:val="single" w:color="999999" w:sz="4"/>
+          <w:left w:val="none" w:sz="0"/>
+          <w:bottom w:val="single" w:color="999999" w:sz="4"/>
+          <w:right w:val="none" w:sz="0"/>
+          <w:insideH w:val="single" w:color="CCCCCC" w:sz="2"/>
+          <w:insideV w:val="none" w:sz="0"/>
+        </w:tblBorders>
+      </w:tblPr>
+      <w:tblGrid>
+        <w:gridCol w:w="2120"/>
+        <w:gridCol w:w="7518"/>
+      </w:tblGrid>
+      <w:tr>
+        <w:trPr>
+          <w:tblHeader/>
+        </w:trPr>
+        <w:tc>
+          <w:tcPr>
+            <w:tcW w:type="dxa" w:w="0"/>
+            <w:shd w:fill="E6ECEB" w:color="auto" w:val="clear"/>
+            <w:tcMar>
+              <w:top w:type="dxa" w:w="60"/>
+              <w:left w:type="dxa" w:w="80"/>
+              <w:bottom w:type="dxa" w:w="60"/>
+              <w:right w:type="dxa" w:w="80"/>
+            </w:tcMar>
+          </w:tcPr>
+          <w:p>
+            <w:r>
+              <w:rPr>
+                <w:b/>
+                <w:bCs/>
+                <w:sz w:val="18"/>
+                <w:szCs w:val="18"/>
+              </w:rPr>
+              <w:t xml:space="preserve">Decoder field</w:t>
+            </w:r>
+          </w:p>
+        </w:tc>
+        <w:tc>
+          <w:tcPr>
+            <w:tcW w:type="dxa" w:w="0"/>
+            <w:shd w:fill="E6ECEB" w:color="auto" w:val="clear"/>
+            <w:tcMar>
+              <w:top w:type="dxa" w:w="60"/>
+              <w:left w:type="dxa" w:w="80"/>
+              <w:bottom w:type="dxa" w:w="60"/>
+              <w:right w:type="dxa" w:w="80"/>
+            </w:tcMar>
+          </w:tcPr>
+          <w:p>
+            <w:r>
+              <w:rPr>
+                <w:b/>
+                <w:bCs/>
+                <w:sz w:val="18"/>
+                <w:szCs w:val="18"/>
+              </w:rPr>
+              <w:t xml:space="preserve">Text returned (Nemotron 3 Super, 13.3 s, 25 ids cited, 0 unknown)</w:t>
+            </w:r>
+          </w:p>
+        </w:tc>
+      </w:tr>
+      <w:tr>
+        <w:trPr>
+          <w:tblHeader w:val="false"/>
+        </w:trPr>
+        <w:tc>
+          <w:tcPr>
+            <w:tcW w:type="dxa" w:w="0"/>
+            <w:tcMar>
+              <w:top w:type="dxa" w:w="60"/>
+              <w:left w:type="dxa" w:w="80"/>
+              <w:bottom w:type="dxa" w:w="60"/>
+              <w:right w:type="dxa" w:w="80"/>
+            </w:tcMar>
+          </w:tcPr>
+          <w:p>
+            <w:r>
+              <w:rPr>
+                <w:b w:val="false"/>
+                <w:bCs w:val="false"/>
+                <w:sz w:val="18"/>
+                <w:szCs w:val="18"/>
+              </w:rPr>
+              <w:t xml:space="preserve">summary</w:t>
+            </w:r>
+          </w:p>
+        </w:tc>
+        <w:tc>
+          <w:tcPr>
+            <w:tcW w:type="dxa" w:w="0"/>
+            <w:tcMar>
+              <w:top w:type="dxa" w:w="60"/>
+              <w:left w:type="dxa" w:w="80"/>
+              <w:bottom w:type="dxa" w:w="60"/>
+              <w:right w:type="dxa" w:w="80"/>
+            </w:tcMar>
+          </w:tcPr>
+          <w:p>
+            <w:r>
+              <w:rPr>
+                <w:b w:val="false"/>
+                <w:bCs w:val="false"/>
+                <w:sz w:val="18"/>
+                <w:szCs w:val="18"/>
+              </w:rPr>
+              <w:t xml:space="preserve">Individual HG00103 is of EUR ancestry (GBR population) and carries 994 haploblock clusters. The GNN phenotype prediction for this individual is 'control', which is a synthetic case/control label used for pipeline testing. Several ancestry-informative clusters are carried, showing high enrichment in various populations including EUR, EAS, and SAS.</w:t>
+            </w:r>
+          </w:p>
+        </w:tc>
+      </w:tr>
+      <w:tr>
+        <w:trPr>
+          <w:tblHeader w:val="false"/>
+        </w:trPr>
+        <w:tc>
+          <w:tcPr>
+            <w:tcW w:type="dxa" w:w="0"/>
+            <w:tcMar>
+              <w:top w:type="dxa" w:w="60"/>
+              <w:left w:type="dxa" w:w="80"/>
+              <w:bottom w:type="dxa" w:w="60"/>
+              <w:right w:type="dxa" w:w="80"/>
+            </w:tcMar>
+          </w:tcPr>
+          <w:p>
+            <w:r>
+              <w:rPr>
+                <w:b w:val="false"/>
+                <w:bCs w:val="false"/>
+                <w:sz w:val="18"/>
+                <w:szCs w:val="18"/>
+              </w:rPr>
+              <w:t xml:space="preserve">ancestry_assessment</w:t>
+            </w:r>
+          </w:p>
+        </w:tc>
+        <w:tc>
+          <w:tcPr>
+            <w:tcW w:type="dxa" w:w="0"/>
+            <w:tcMar>
+              <w:top w:type="dxa" w:w="60"/>
+              <w:left w:type="dxa" w:w="80"/>
+              <w:bottom w:type="dxa" w:w="60"/>
+              <w:right w:type="dxa" w:w="80"/>
+            </w:tcMar>
+          </w:tcPr>
+          <w:p>
+            <w:r>
+              <w:rPr>
+                <w:b w:val="false"/>
+                <w:bCs w:val="false"/>
+                <w:sz w:val="18"/>
+                <w:szCs w:val="18"/>
+              </w:rPr>
+              <w:t xml:space="preserve">The individual's ancestry is EUR (European) as per the 1000G panel data, with population label GBR. This reflects population structure, not a medical finding.</w:t>
+            </w:r>
+          </w:p>
+        </w:tc>
+      </w:tr>
+      <w:tr>
+        <w:trPr>
+          <w:tblHeader w:val="false"/>
+        </w:trPr>
+        <w:tc>
+          <w:tcPr>
+            <w:tcW w:type="dxa" w:w="0"/>
+            <w:tcMar>
+              <w:top w:type="dxa" w:w="60"/>
+              <w:left w:type="dxa" w:w="80"/>
+              <w:bottom w:type="dxa" w:w="60"/>
+              <w:right w:type="dxa" w:w="80"/>
+            </w:tcMar>
+          </w:tcPr>
+          <w:p>
+            <w:r>
+              <w:rPr>
+                <w:b w:val="false"/>
+                <w:bCs w:val="false"/>
+                <w:sz w:val="18"/>
+                <w:szCs w:val="18"/>
+              </w:rPr>
+              <w:t xml:space="preserve">phenotype_assessment</w:t>
+            </w:r>
+          </w:p>
+        </w:tc>
+        <w:tc>
+          <w:tcPr>
+            <w:tcW w:type="dxa" w:w="0"/>
+            <w:tcMar>
+              <w:top w:type="dxa" w:w="60"/>
+              <w:left w:type="dxa" w:w="80"/>
+              <w:bottom w:type="dxa" w:w="60"/>
+              <w:right w:type="dxa" w:w="80"/>
+            </w:tcMar>
+          </w:tcPr>
+          <w:p>
+            <w:r>
+              <w:rPr>
+                <w:b w:val="false"/>
+                <w:bCs w:val="false"/>
+                <w:sz w:val="18"/>
+                <w:szCs w:val="18"/>
+              </w:rPr>
+              <w:t xml:space="preserve">The GNN-predicted phenotype is 'control', which is a synthetic case/control label used to test the pipeline; it does not reflect a real medical condition.</w:t>
+            </w:r>
+          </w:p>
+        </w:tc>
+      </w:tr>
+      <w:tr>
+        <w:trPr>
+          <w:tblHeader w:val="false"/>
+        </w:trPr>
+        <w:tc>
+          <w:tcPr>
+            <w:tcW w:type="dxa" w:w="0"/>
+            <w:tcMar>
+              <w:top w:type="dxa" w:w="60"/>
+              <w:left w:type="dxa" w:w="80"/>
+              <w:bottom w:type="dxa" w:w="60"/>
+              <w:right w:type="dxa" w:w="80"/>
+            </w:tcMar>
+          </w:tcPr>
+          <w:p>
+            <w:r>
+              <w:rPr>
+                <w:b w:val="false"/>
+                <w:bCs w:val="false"/>
+                <w:sz w:val="18"/>
+                <w:szCs w:val="18"/>
+              </w:rPr>
+              <w:t xml:space="preserve">genome_proteome_links</w:t>
+            </w:r>
+          </w:p>
+        </w:tc>
+        <w:tc>
+          <w:tcPr>
+            <w:tcW w:type="dxa" w:w="0"/>
+            <w:tcMar>
+              <w:top w:type="dxa" w:w="60"/>
+              <w:left w:type="dxa" w:w="80"/>
+              <w:bottom w:type="dxa" w:w="60"/>
+              <w:right w:type="dxa" w:w="80"/>
+            </w:tcMar>
+          </w:tcPr>
+          <w:p>
+            <w:r>
+              <w:rPr>
+                <w:b w:val="false"/>
+                <w:bCs w:val="false"/>
+                <w:sz w:val="18"/>
+                <w:szCs w:val="18"/>
+              </w:rPr>
+              <w:t xml:space="preserve">cluster151 -&gt; block 40032702-40132216 -&gt; TNRC6B -&gt; Q9UPQ9 (carried, enriched in EAS); cluster545 -&gt; RBFOX2 -&gt; O43251; cluster35 -&gt; MYO18B -&gt; Q8IUG5 (enriched in EUR)</w:t>
+            </w:r>
+          </w:p>
+        </w:tc>
+      </w:tr>
+      <w:tr>
+        <w:trPr>
+          <w:tblHeader w:val="false"/>
+        </w:trPr>
+        <w:tc>
+          <w:tcPr>
+            <w:tcW w:type="dxa" w:w="0"/>
+            <w:tcMar>
+              <w:top w:type="dxa" w:w="60"/>
+              <w:left w:type="dxa" w:w="80"/>
+              <w:bottom w:type="dxa" w:w="60"/>
+              <w:right w:type="dxa" w:w="80"/>
+            </w:tcMar>
+          </w:tcPr>
+          <w:p>
+            <w:r>
+              <w:rPr>
+                <w:b w:val="false"/>
+                <w:bCs w:val="false"/>
+                <w:sz w:val="18"/>
+                <w:szCs w:val="18"/>
+              </w:rPr>
+              <w:t xml:space="preserve">caveats</w:t>
+            </w:r>
+          </w:p>
+        </w:tc>
+        <w:tc>
+          <w:tcPr>
+            <w:tcW w:type="dxa" w:w="0"/>
+            <w:tcMar>
+              <w:top w:type="dxa" w:w="60"/>
+              <w:left w:type="dxa" w:w="80"/>
+              <w:bottom w:type="dxa" w:w="60"/>
+              <w:right w:type="dxa" w:w="80"/>
+            </w:tcMar>
+          </w:tcPr>
+          <w:p>
+            <w:r>
+              <w:rPr>
+                <w:b w:val="false"/>
+                <w:bCs w:val="false"/>
+                <w:sz w:val="18"/>
+                <w:szCs w:val="18"/>
+              </w:rPr>
+              <w:t xml:space="preserve">ancestry is population structure, not a medical finding; the phenotype is synthetic; not all clusters have gene or protein annotations; the prediction comes from the embedding and may not match observed protein levels</w:t>
+            </w:r>
+          </w:p>
+        </w:tc>
+      </w:tr>
+    </w:tbl>
+    <w:p>
+      <w:pPr>
+        <w:spacing w:after="160"/>
+      </w:pPr>
+    </w:p>
+    <w:p>
+      <w:pPr>
+        <w:spacing w:after="140"/>
+      </w:pPr>
+      <w:r>
+        <w:t xml:space="preserve">What the LLM adds is the sentence layer: a readable paragraph, the genome-to-protein chain spelled out per person, the right hedges attached automatically, graceful handling of missing information (for HG00096, who is not in the held-out split, it reported that no prediction exists instead of inventing one), and traceability, because every claim carries an id that the code verifies. It makes no prediction and adds no outside knowledge.</w:t>
+      </w:r>
+    </w:p>
     <w:p>
       <w:pPr>
         <w:pStyle w:val="Heading2"/>
@@ -14319,6 +14963,849 @@
           <w:szCs w:val="18"/>
         </w:rPr>
         <w:t xml:space="preserve">With and without federation: each site trained alone on its own people versus the federated global model, scored on the same held-out people per site (A100 re-run).</w:t>
+      </w:r>
+    </w:p>
+    <w:tbl>
+      <w:tblPr>
+        <w:tblW w:type="dxa" w:w="9638"/>
+        <w:tblBorders>
+          <w:top w:val="single" w:color="999999" w:sz="4"/>
+          <w:left w:val="none" w:sz="0"/>
+          <w:bottom w:val="single" w:color="999999" w:sz="4"/>
+          <w:right w:val="none" w:sz="0"/>
+          <w:insideH w:val="single" w:color="CCCCCC" w:sz="2"/>
+          <w:insideV w:val="none" w:sz="0"/>
+        </w:tblBorders>
+      </w:tblPr>
+      <w:tblGrid>
+        <w:gridCol w:w="3084"/>
+        <w:gridCol w:w="1638"/>
+        <w:gridCol w:w="1638"/>
+        <w:gridCol w:w="1638"/>
+        <w:gridCol w:w="1638"/>
+      </w:tblGrid>
+      <w:tr>
+        <w:trPr>
+          <w:tblHeader/>
+        </w:trPr>
+        <w:tc>
+          <w:tcPr>
+            <w:tcW w:type="dxa" w:w="0"/>
+            <w:shd w:fill="E6ECEB" w:color="auto" w:val="clear"/>
+            <w:tcMar>
+              <w:top w:type="dxa" w:w="60"/>
+              <w:left w:type="dxa" w:w="80"/>
+              <w:bottom w:type="dxa" w:w="60"/>
+              <w:right w:type="dxa" w:w="80"/>
+            </w:tcMar>
+          </w:tcPr>
+          <w:p>
+            <w:r>
+              <w:rPr>
+                <w:b/>
+                <w:bCs/>
+                <w:sz w:val="18"/>
+                <w:szCs w:val="18"/>
+              </w:rPr>
+              <w:t xml:space="preserve">Site (held-out n)</w:t>
+            </w:r>
+          </w:p>
+        </w:tc>
+        <w:tc>
+          <w:tcPr>
+            <w:tcW w:type="dxa" w:w="0"/>
+            <w:shd w:fill="E6ECEB" w:color="auto" w:val="clear"/>
+            <w:tcMar>
+              <w:top w:type="dxa" w:w="60"/>
+              <w:left w:type="dxa" w:w="80"/>
+              <w:bottom w:type="dxa" w:w="60"/>
+              <w:right w:type="dxa" w:w="80"/>
+            </w:tcMar>
+          </w:tcPr>
+          <w:p>
+            <w:r>
+              <w:rPr>
+                <w:b/>
+                <w:bCs/>
+                <w:sz w:val="18"/>
+                <w:szCs w:val="18"/>
+              </w:rPr>
+              <w:t xml:space="preserve">Alone, 150 steps</w:t>
+            </w:r>
+          </w:p>
+        </w:tc>
+        <w:tc>
+          <w:tcPr>
+            <w:tcW w:type="dxa" w:w="0"/>
+            <w:shd w:fill="E6ECEB" w:color="auto" w:val="clear"/>
+            <w:tcMar>
+              <w:top w:type="dxa" w:w="60"/>
+              <w:left w:type="dxa" w:w="80"/>
+              <w:bottom w:type="dxa" w:w="60"/>
+              <w:right w:type="dxa" w:w="80"/>
+            </w:tcMar>
+          </w:tcPr>
+          <w:p>
+            <w:r>
+              <w:rPr>
+                <w:b/>
+                <w:bCs/>
+                <w:sz w:val="18"/>
+                <w:szCs w:val="18"/>
+              </w:rPr>
+              <w:t xml:space="preserve">Federated, 150 steps</w:t>
+            </w:r>
+          </w:p>
+        </w:tc>
+        <w:tc>
+          <w:tcPr>
+            <w:tcW w:type="dxa" w:w="0"/>
+            <w:shd w:fill="E6ECEB" w:color="auto" w:val="clear"/>
+            <w:tcMar>
+              <w:top w:type="dxa" w:w="60"/>
+              <w:left w:type="dxa" w:w="80"/>
+              <w:bottom w:type="dxa" w:w="60"/>
+              <w:right w:type="dxa" w:w="80"/>
+            </w:tcMar>
+          </w:tcPr>
+          <w:p>
+            <w:r>
+              <w:rPr>
+                <w:b/>
+                <w:bCs/>
+                <w:sz w:val="18"/>
+                <w:szCs w:val="18"/>
+              </w:rPr>
+              <w:t xml:space="preserve">Alone, 50 steps</w:t>
+            </w:r>
+          </w:p>
+        </w:tc>
+        <w:tc>
+          <w:tcPr>
+            <w:tcW w:type="dxa" w:w="0"/>
+            <w:shd w:fill="E6ECEB" w:color="auto" w:val="clear"/>
+            <w:tcMar>
+              <w:top w:type="dxa" w:w="60"/>
+              <w:left w:type="dxa" w:w="80"/>
+              <w:bottom w:type="dxa" w:w="60"/>
+              <w:right w:type="dxa" w:w="80"/>
+            </w:tcMar>
+          </w:tcPr>
+          <w:p>
+            <w:r>
+              <w:rPr>
+                <w:b/>
+                <w:bCs/>
+                <w:sz w:val="18"/>
+                <w:szCs w:val="18"/>
+              </w:rPr>
+              <w:t xml:space="preserve">Federated, 50 steps</w:t>
+            </w:r>
+          </w:p>
+        </w:tc>
+      </w:tr>
+      <w:tr>
+        <w:trPr>
+          <w:tblHeader w:val="false"/>
+        </w:trPr>
+        <w:tc>
+          <w:tcPr>
+            <w:tcW w:type="dxa" w:w="0"/>
+            <w:tcMar>
+              <w:top w:type="dxa" w:w="60"/>
+              <w:left w:type="dxa" w:w="80"/>
+              <w:bottom w:type="dxa" w:w="60"/>
+              <w:right w:type="dxa" w:w="80"/>
+            </w:tcMar>
+          </w:tcPr>
+          <w:p>
+            <w:r>
+              <w:rPr>
+                <w:b w:val="false"/>
+                <w:bCs w:val="false"/>
+                <w:sz w:val="18"/>
+                <w:szCs w:val="18"/>
+              </w:rPr>
+              <w:t xml:space="preserve">SITE1 (111)</w:t>
+            </w:r>
+          </w:p>
+        </w:tc>
+        <w:tc>
+          <w:tcPr>
+            <w:tcW w:type="dxa" w:w="0"/>
+            <w:tcMar>
+              <w:top w:type="dxa" w:w="60"/>
+              <w:left w:type="dxa" w:w="80"/>
+              <w:bottom w:type="dxa" w:w="60"/>
+              <w:right w:type="dxa" w:w="80"/>
+            </w:tcMar>
+          </w:tcPr>
+          <w:p>
+            <w:r>
+              <w:rPr>
+                <w:b w:val="false"/>
+                <w:bCs w:val="false"/>
+                <w:sz w:val="18"/>
+                <w:szCs w:val="18"/>
+              </w:rPr>
+              <w:t xml:space="preserve">0.998 / 0.952</w:t>
+            </w:r>
+          </w:p>
+        </w:tc>
+        <w:tc>
+          <w:tcPr>
+            <w:tcW w:type="dxa" w:w="0"/>
+            <w:tcMar>
+              <w:top w:type="dxa" w:w="60"/>
+              <w:left w:type="dxa" w:w="80"/>
+              <w:bottom w:type="dxa" w:w="60"/>
+              <w:right w:type="dxa" w:w="80"/>
+            </w:tcMar>
+          </w:tcPr>
+          <w:p>
+            <w:r>
+              <w:rPr>
+                <w:b w:val="false"/>
+                <w:bCs w:val="false"/>
+                <w:sz w:val="18"/>
+                <w:szCs w:val="18"/>
+              </w:rPr>
+              <w:t xml:space="preserve">0.999 / 0.983</w:t>
+            </w:r>
+          </w:p>
+        </w:tc>
+        <w:tc>
+          <w:tcPr>
+            <w:tcW w:type="dxa" w:w="0"/>
+            <w:tcMar>
+              <w:top w:type="dxa" w:w="60"/>
+              <w:left w:type="dxa" w:w="80"/>
+              <w:bottom w:type="dxa" w:w="60"/>
+              <w:right w:type="dxa" w:w="80"/>
+            </w:tcMar>
+          </w:tcPr>
+          <w:p>
+            <w:r>
+              <w:rPr>
+                <w:b w:val="false"/>
+                <w:bCs w:val="false"/>
+                <w:sz w:val="18"/>
+                <w:szCs w:val="18"/>
+              </w:rPr>
+              <w:t xml:space="preserve">0.881 / 0.543</w:t>
+            </w:r>
+          </w:p>
+        </w:tc>
+        <w:tc>
+          <w:tcPr>
+            <w:tcW w:type="dxa" w:w="0"/>
+            <w:tcMar>
+              <w:top w:type="dxa" w:w="60"/>
+              <w:left w:type="dxa" w:w="80"/>
+              <w:bottom w:type="dxa" w:w="60"/>
+              <w:right w:type="dxa" w:w="80"/>
+            </w:tcMar>
+          </w:tcPr>
+          <w:p>
+            <w:r>
+              <w:rPr>
+                <w:b w:val="false"/>
+                <w:bCs w:val="false"/>
+                <w:sz w:val="18"/>
+                <w:szCs w:val="18"/>
+              </w:rPr>
+              <w:t xml:space="preserve">0.998 / 0.950</w:t>
+            </w:r>
+          </w:p>
+        </w:tc>
+      </w:tr>
+      <w:tr>
+        <w:trPr>
+          <w:tblHeader w:val="false"/>
+        </w:trPr>
+        <w:tc>
+          <w:tcPr>
+            <w:tcW w:type="dxa" w:w="0"/>
+            <w:tcMar>
+              <w:top w:type="dxa" w:w="60"/>
+              <w:left w:type="dxa" w:w="80"/>
+              <w:bottom w:type="dxa" w:w="60"/>
+              <w:right w:type="dxa" w:w="80"/>
+            </w:tcMar>
+          </w:tcPr>
+          <w:p>
+            <w:r>
+              <w:rPr>
+                <w:b w:val="false"/>
+                <w:bCs w:val="false"/>
+                <w:sz w:val="18"/>
+                <w:szCs w:val="18"/>
+              </w:rPr>
+              <w:t xml:space="preserve">SITE2 (136)</w:t>
+            </w:r>
+          </w:p>
+        </w:tc>
+        <w:tc>
+          <w:tcPr>
+            <w:tcW w:type="dxa" w:w="0"/>
+            <w:tcMar>
+              <w:top w:type="dxa" w:w="60"/>
+              <w:left w:type="dxa" w:w="80"/>
+              <w:bottom w:type="dxa" w:w="60"/>
+              <w:right w:type="dxa" w:w="80"/>
+            </w:tcMar>
+          </w:tcPr>
+          <w:p>
+            <w:r>
+              <w:rPr>
+                <w:b w:val="false"/>
+                <w:bCs w:val="false"/>
+                <w:sz w:val="18"/>
+                <w:szCs w:val="18"/>
+              </w:rPr>
+              <w:t xml:space="preserve">0.986 / 0.852</w:t>
+            </w:r>
+          </w:p>
+        </w:tc>
+        <w:tc>
+          <w:tcPr>
+            <w:tcW w:type="dxa" w:w="0"/>
+            <w:tcMar>
+              <w:top w:type="dxa" w:w="60"/>
+              <w:left w:type="dxa" w:w="80"/>
+              <w:bottom w:type="dxa" w:w="60"/>
+              <w:right w:type="dxa" w:w="80"/>
+            </w:tcMar>
+          </w:tcPr>
+          <w:p>
+            <w:r>
+              <w:rPr>
+                <w:b w:val="false"/>
+                <w:bCs w:val="false"/>
+                <w:sz w:val="18"/>
+                <w:szCs w:val="18"/>
+              </w:rPr>
+              <w:t xml:space="preserve">1.000 / 0.991</w:t>
+            </w:r>
+          </w:p>
+        </w:tc>
+        <w:tc>
+          <w:tcPr>
+            <w:tcW w:type="dxa" w:w="0"/>
+            <w:tcMar>
+              <w:top w:type="dxa" w:w="60"/>
+              <w:left w:type="dxa" w:w="80"/>
+              <w:bottom w:type="dxa" w:w="60"/>
+              <w:right w:type="dxa" w:w="80"/>
+            </w:tcMar>
+          </w:tcPr>
+          <w:p>
+            <w:r>
+              <w:rPr>
+                <w:b w:val="false"/>
+                <w:bCs w:val="false"/>
+                <w:sz w:val="18"/>
+                <w:szCs w:val="18"/>
+              </w:rPr>
+              <w:t xml:space="preserve">0.902 / 0.772</w:t>
+            </w:r>
+          </w:p>
+        </w:tc>
+        <w:tc>
+          <w:tcPr>
+            <w:tcW w:type="dxa" w:w="0"/>
+            <w:tcMar>
+              <w:top w:type="dxa" w:w="60"/>
+              <w:left w:type="dxa" w:w="80"/>
+              <w:bottom w:type="dxa" w:w="60"/>
+              <w:right w:type="dxa" w:w="80"/>
+            </w:tcMar>
+          </w:tcPr>
+          <w:p>
+            <w:r>
+              <w:rPr>
+                <w:b w:val="false"/>
+                <w:bCs w:val="false"/>
+                <w:sz w:val="18"/>
+                <w:szCs w:val="18"/>
+              </w:rPr>
+              <w:t xml:space="preserve">0.991 / 0.907</w:t>
+            </w:r>
+          </w:p>
+        </w:tc>
+      </w:tr>
+      <w:tr>
+        <w:trPr>
+          <w:tblHeader w:val="false"/>
+        </w:trPr>
+        <w:tc>
+          <w:tcPr>
+            <w:tcW w:type="dxa" w:w="0"/>
+            <w:tcMar>
+              <w:top w:type="dxa" w:w="60"/>
+              <w:left w:type="dxa" w:w="80"/>
+              <w:bottom w:type="dxa" w:w="60"/>
+              <w:right w:type="dxa" w:w="80"/>
+            </w:tcMar>
+          </w:tcPr>
+          <w:p>
+            <w:r>
+              <w:rPr>
+                <w:b w:val="false"/>
+                <w:bCs w:val="false"/>
+                <w:sz w:val="18"/>
+                <w:szCs w:val="18"/>
+              </w:rPr>
+              <w:t xml:space="preserve">SITE3 (129)</w:t>
+            </w:r>
+          </w:p>
+        </w:tc>
+        <w:tc>
+          <w:tcPr>
+            <w:tcW w:type="dxa" w:w="0"/>
+            <w:tcMar>
+              <w:top w:type="dxa" w:w="60"/>
+              <w:left w:type="dxa" w:w="80"/>
+              <w:bottom w:type="dxa" w:w="60"/>
+              <w:right w:type="dxa" w:w="80"/>
+            </w:tcMar>
+          </w:tcPr>
+          <w:p>
+            <w:r>
+              <w:rPr>
+                <w:b w:val="false"/>
+                <w:bCs w:val="false"/>
+                <w:sz w:val="18"/>
+                <w:szCs w:val="18"/>
+              </w:rPr>
+              <w:t xml:space="preserve">0.988 / 0.923</w:t>
+            </w:r>
+          </w:p>
+        </w:tc>
+        <w:tc>
+          <w:tcPr>
+            <w:tcW w:type="dxa" w:w="0"/>
+            <w:tcMar>
+              <w:top w:type="dxa" w:w="60"/>
+              <w:left w:type="dxa" w:w="80"/>
+              <w:bottom w:type="dxa" w:w="60"/>
+              <w:right w:type="dxa" w:w="80"/>
+            </w:tcMar>
+          </w:tcPr>
+          <w:p>
+            <w:r>
+              <w:rPr>
+                <w:b w:val="false"/>
+                <w:bCs w:val="false"/>
+                <w:sz w:val="18"/>
+                <w:szCs w:val="18"/>
+              </w:rPr>
+              <w:t xml:space="preserve">0.968 / 0.933</w:t>
+            </w:r>
+          </w:p>
+        </w:tc>
+        <w:tc>
+          <w:tcPr>
+            <w:tcW w:type="dxa" w:w="0"/>
+            <w:tcMar>
+              <w:top w:type="dxa" w:w="60"/>
+              <w:left w:type="dxa" w:w="80"/>
+              <w:bottom w:type="dxa" w:w="60"/>
+              <w:right w:type="dxa" w:w="80"/>
+            </w:tcMar>
+          </w:tcPr>
+          <w:p>
+            <w:r>
+              <w:rPr>
+                <w:b w:val="false"/>
+                <w:bCs w:val="false"/>
+                <w:sz w:val="18"/>
+                <w:szCs w:val="18"/>
+              </w:rPr>
+              <w:t xml:space="preserve">0.915 / 0.830</w:t>
+            </w:r>
+          </w:p>
+        </w:tc>
+        <w:tc>
+          <w:tcPr>
+            <w:tcW w:type="dxa" w:w="0"/>
+            <w:tcMar>
+              <w:top w:type="dxa" w:w="60"/>
+              <w:left w:type="dxa" w:w="80"/>
+              <w:bottom w:type="dxa" w:w="60"/>
+              <w:right w:type="dxa" w:w="80"/>
+            </w:tcMar>
+          </w:tcPr>
+          <w:p>
+            <w:r>
+              <w:rPr>
+                <w:b w:val="false"/>
+                <w:bCs w:val="false"/>
+                <w:sz w:val="18"/>
+                <w:szCs w:val="18"/>
+              </w:rPr>
+              <w:t xml:space="preserve">0.989 / 0.865</w:t>
+            </w:r>
+          </w:p>
+        </w:tc>
+      </w:tr>
+      <w:tr>
+        <w:trPr>
+          <w:tblHeader w:val="false"/>
+        </w:trPr>
+        <w:tc>
+          <w:tcPr>
+            <w:tcW w:type="dxa" w:w="0"/>
+            <w:tcMar>
+              <w:top w:type="dxa" w:w="60"/>
+              <w:left w:type="dxa" w:w="80"/>
+              <w:bottom w:type="dxa" w:w="60"/>
+              <w:right w:type="dxa" w:w="80"/>
+            </w:tcMar>
+          </w:tcPr>
+          <w:p>
+            <w:r>
+              <w:rPr>
+                <w:b w:val="false"/>
+                <w:bCs w:val="false"/>
+                <w:sz w:val="18"/>
+                <w:szCs w:val="18"/>
+              </w:rPr>
+              <w:t xml:space="preserve">average over sites</w:t>
+            </w:r>
+          </w:p>
+        </w:tc>
+        <w:tc>
+          <w:tcPr>
+            <w:tcW w:type="dxa" w:w="0"/>
+            <w:tcMar>
+              <w:top w:type="dxa" w:w="60"/>
+              <w:left w:type="dxa" w:w="80"/>
+              <w:bottom w:type="dxa" w:w="60"/>
+              <w:right w:type="dxa" w:w="80"/>
+            </w:tcMar>
+          </w:tcPr>
+          <w:p>
+            <w:r>
+              <w:rPr>
+                <w:b w:val="false"/>
+                <w:bCs w:val="false"/>
+                <w:sz w:val="18"/>
+                <w:szCs w:val="18"/>
+              </w:rPr>
+              <w:t xml:space="preserve">0.991 / 0.909</w:t>
+            </w:r>
+          </w:p>
+        </w:tc>
+        <w:tc>
+          <w:tcPr>
+            <w:tcW w:type="dxa" w:w="0"/>
+            <w:tcMar>
+              <w:top w:type="dxa" w:w="60"/>
+              <w:left w:type="dxa" w:w="80"/>
+              <w:bottom w:type="dxa" w:w="60"/>
+              <w:right w:type="dxa" w:w="80"/>
+            </w:tcMar>
+          </w:tcPr>
+          <w:p>
+            <w:r>
+              <w:rPr>
+                <w:b w:val="false"/>
+                <w:bCs w:val="false"/>
+                <w:sz w:val="18"/>
+                <w:szCs w:val="18"/>
+              </w:rPr>
+              <w:t xml:space="preserve">0.989 / 0.969</w:t>
+            </w:r>
+          </w:p>
+        </w:tc>
+        <w:tc>
+          <w:tcPr>
+            <w:tcW w:type="dxa" w:w="0"/>
+            <w:tcMar>
+              <w:top w:type="dxa" w:w="60"/>
+              <w:left w:type="dxa" w:w="80"/>
+              <w:bottom w:type="dxa" w:w="60"/>
+              <w:right w:type="dxa" w:w="80"/>
+            </w:tcMar>
+          </w:tcPr>
+          <w:p>
+            <w:r>
+              <w:rPr>
+                <w:b w:val="false"/>
+                <w:bCs w:val="false"/>
+                <w:sz w:val="18"/>
+                <w:szCs w:val="18"/>
+              </w:rPr>
+              <w:t xml:space="preserve">0.899 / 0.715</w:t>
+            </w:r>
+          </w:p>
+        </w:tc>
+        <w:tc>
+          <w:tcPr>
+            <w:tcW w:type="dxa" w:w="0"/>
+            <w:tcMar>
+              <w:top w:type="dxa" w:w="60"/>
+              <w:left w:type="dxa" w:w="80"/>
+              <w:bottom w:type="dxa" w:w="60"/>
+              <w:right w:type="dxa" w:w="80"/>
+            </w:tcMar>
+          </w:tcPr>
+          <w:p>
+            <w:r>
+              <w:rPr>
+                <w:b w:val="false"/>
+                <w:bCs w:val="false"/>
+                <w:sz w:val="18"/>
+                <w:szCs w:val="18"/>
+              </w:rPr>
+              <w:t xml:space="preserve">0.993 / 0.907</w:t>
+            </w:r>
+          </w:p>
+        </w:tc>
+      </w:tr>
+      <w:tr>
+        <w:trPr>
+          <w:tblHeader w:val="false"/>
+        </w:trPr>
+        <w:tc>
+          <w:tcPr>
+            <w:tcW w:type="dxa" w:w="0"/>
+            <w:tcMar>
+              <w:top w:type="dxa" w:w="60"/>
+              <w:left w:type="dxa" w:w="80"/>
+              <w:bottom w:type="dxa" w:w="60"/>
+              <w:right w:type="dxa" w:w="80"/>
+            </w:tcMar>
+          </w:tcPr>
+          <w:p>
+            <w:r>
+              <w:rPr>
+                <w:b w:val="false"/>
+                <w:bCs w:val="false"/>
+                <w:sz w:val="18"/>
+                <w:szCs w:val="18"/>
+              </w:rPr>
+              <w:t xml:space="preserve">pooled 376 people, federated global model</w:t>
+            </w:r>
+          </w:p>
+        </w:tc>
+        <w:tc>
+          <w:tcPr>
+            <w:tcW w:type="dxa" w:w="0"/>
+            <w:tcMar>
+              <w:top w:type="dxa" w:w="60"/>
+              <w:left w:type="dxa" w:w="80"/>
+              <w:bottom w:type="dxa" w:w="60"/>
+              <w:right w:type="dxa" w:w="80"/>
+            </w:tcMar>
+          </w:tcPr>
+          <w:p>
+            <w:r>
+              <w:rPr>
+                <w:b w:val="false"/>
+                <w:bCs w:val="false"/>
+                <w:sz w:val="18"/>
+                <w:szCs w:val="18"/>
+              </w:rPr>
+              <w:t xml:space="preserve">-</w:t>
+            </w:r>
+          </w:p>
+        </w:tc>
+        <w:tc>
+          <w:tcPr>
+            <w:tcW w:type="dxa" w:w="0"/>
+            <w:tcMar>
+              <w:top w:type="dxa" w:w="60"/>
+              <w:left w:type="dxa" w:w="80"/>
+              <w:bottom w:type="dxa" w:w="60"/>
+              <w:right w:type="dxa" w:w="80"/>
+            </w:tcMar>
+          </w:tcPr>
+          <w:p>
+            <w:r>
+              <w:rPr>
+                <w:b w:val="false"/>
+                <w:bCs w:val="false"/>
+                <w:sz w:val="18"/>
+                <w:szCs w:val="18"/>
+              </w:rPr>
+              <w:t xml:space="preserve">0.987 / 0.967</w:t>
+            </w:r>
+          </w:p>
+        </w:tc>
+        <w:tc>
+          <w:tcPr>
+            <w:tcW w:type="dxa" w:w="0"/>
+            <w:tcMar>
+              <w:top w:type="dxa" w:w="60"/>
+              <w:left w:type="dxa" w:w="80"/>
+              <w:bottom w:type="dxa" w:w="60"/>
+              <w:right w:type="dxa" w:w="80"/>
+            </w:tcMar>
+          </w:tcPr>
+          <w:p>
+            <w:r>
+              <w:rPr>
+                <w:b w:val="false"/>
+                <w:bCs w:val="false"/>
+                <w:sz w:val="18"/>
+                <w:szCs w:val="18"/>
+              </w:rPr>
+              <w:t xml:space="preserve">-</w:t>
+            </w:r>
+          </w:p>
+        </w:tc>
+        <w:tc>
+          <w:tcPr>
+            <w:tcW w:type="dxa" w:w="0"/>
+            <w:tcMar>
+              <w:top w:type="dxa" w:w="60"/>
+              <w:left w:type="dxa" w:w="80"/>
+              <w:bottom w:type="dxa" w:w="60"/>
+              <w:right w:type="dxa" w:w="80"/>
+            </w:tcMar>
+          </w:tcPr>
+          <w:p>
+            <w:r>
+              <w:rPr>
+                <w:b w:val="false"/>
+                <w:bCs w:val="false"/>
+                <w:sz w:val="18"/>
+                <w:szCs w:val="18"/>
+              </w:rPr>
+              <w:t xml:space="preserve">0.991 / 0.901</w:t>
+            </w:r>
+          </w:p>
+        </w:tc>
+      </w:tr>
+      <w:tr>
+        <w:trPr>
+          <w:tblHeader w:val="false"/>
+        </w:trPr>
+        <w:tc>
+          <w:tcPr>
+            <w:tcW w:type="dxa" w:w="0"/>
+            <w:tcMar>
+              <w:top w:type="dxa" w:w="60"/>
+              <w:left w:type="dxa" w:w="80"/>
+              <w:bottom w:type="dxa" w:w="60"/>
+              <w:right w:type="dxa" w:w="80"/>
+            </w:tcMar>
+          </w:tcPr>
+          <w:p>
+            <w:r>
+              <w:rPr>
+                <w:b w:val="false"/>
+                <w:bCs w:val="false"/>
+                <w:sz w:val="18"/>
+                <w:szCs w:val="18"/>
+              </w:rPr>
+              <w:t xml:space="preserve">pooled 376 people, central model</w:t>
+            </w:r>
+          </w:p>
+        </w:tc>
+        <w:tc>
+          <w:tcPr>
+            <w:tcW w:type="dxa" w:w="0"/>
+            <w:tcMar>
+              <w:top w:type="dxa" w:w="60"/>
+              <w:left w:type="dxa" w:w="80"/>
+              <w:bottom w:type="dxa" w:w="60"/>
+              <w:right w:type="dxa" w:w="80"/>
+            </w:tcMar>
+          </w:tcPr>
+          <w:p>
+            <w:r>
+              <w:rPr>
+                <w:b w:val="false"/>
+                <w:bCs w:val="false"/>
+                <w:sz w:val="18"/>
+                <w:szCs w:val="18"/>
+              </w:rPr>
+              <w:t xml:space="preserve">0.995 / 0.960</w:t>
+            </w:r>
+          </w:p>
+        </w:tc>
+        <w:tc>
+          <w:tcPr>
+            <w:tcW w:type="dxa" w:w="0"/>
+            <w:tcMar>
+              <w:top w:type="dxa" w:w="60"/>
+              <w:left w:type="dxa" w:w="80"/>
+              <w:bottom w:type="dxa" w:w="60"/>
+              <w:right w:type="dxa" w:w="80"/>
+            </w:tcMar>
+          </w:tcPr>
+          <w:p>
+            <w:r>
+              <w:rPr>
+                <w:b w:val="false"/>
+                <w:bCs w:val="false"/>
+                <w:sz w:val="18"/>
+                <w:szCs w:val="18"/>
+              </w:rPr>
+              <w:t xml:space="preserve"/>
+            </w:r>
+          </w:p>
+        </w:tc>
+        <w:tc>
+          <w:tcPr>
+            <w:tcW w:type="dxa" w:w="0"/>
+            <w:tcMar>
+              <w:top w:type="dxa" w:w="60"/>
+              <w:left w:type="dxa" w:w="80"/>
+              <w:bottom w:type="dxa" w:w="60"/>
+              <w:right w:type="dxa" w:w="80"/>
+            </w:tcMar>
+          </w:tcPr>
+          <w:p>
+            <w:r>
+              <w:rPr>
+                <w:b w:val="false"/>
+                <w:bCs w:val="false"/>
+                <w:sz w:val="18"/>
+                <w:szCs w:val="18"/>
+              </w:rPr>
+              <w:t xml:space="preserve">0.997 / 0.959</w:t>
+            </w:r>
+          </w:p>
+        </w:tc>
+        <w:tc>
+          <w:tcPr>
+            <w:tcW w:type="dxa" w:w="0"/>
+            <w:tcMar>
+              <w:top w:type="dxa" w:w="60"/>
+              <w:left w:type="dxa" w:w="80"/>
+              <w:bottom w:type="dxa" w:w="60"/>
+              <w:right w:type="dxa" w:w="80"/>
+            </w:tcMar>
+          </w:tcPr>
+          <w:p>
+            <w:r>
+              <w:rPr>
+                <w:b w:val="false"/>
+                <w:bCs w:val="false"/>
+                <w:sz w:val="18"/>
+                <w:szCs w:val="18"/>
+              </w:rPr>
+              <w:t xml:space="preserve"/>
+            </w:r>
+          </w:p>
+        </w:tc>
+      </w:tr>
+    </w:tbl>
+    <w:p>
+      <w:pPr>
+        <w:spacing w:after="160"/>
+      </w:pPr>
+    </w:p>
+    <w:p>
+      <w:pPr>
+        <w:spacing w:after="140"/>
+      </w:pPr>
+      <w:r>
+        <w:t xml:space="preserve">AUC / balanced accuracy on each site's own held-out people. Transfer of a lone model to other sites' people (150 steps, AUC): the SITE1 model scores 0.982 on SITE2 people and 0.949 on SITE3 people; SITE2: 0.993 and 0.969; SITE3: 0.997 and 0.998; the federated model 0.999 / 1.000 / 0.968 on the three sites.</w:t>
       </w:r>
     </w:p>
     <w:p>

</xml_diff>